<commit_message>
the final paper submission
Based on our work the entire semester we have created a paper format report
</commit_message>
<xml_diff>
--- a/Report/Task6/Final Paper for CSE366 paper.docx
+++ b/Report/Task6/Final Paper for CSE366 paper.docx
@@ -2854,6 +2854,17 @@
         </w:rPr>
         <w:t>Diagrams:</w:t>
       </w:r>
+    </w:p>
+    <w:p>
+      <w:pPr>
+        <w:spacing w:line="240" w:lineRule="auto"/>
+        <w:jc w:val="left"/>
+        <w:rPr>
+          <w:rFonts w:ascii="Times New Roman" w:hAnsi="Times New Roman" w:cs="Times New Roman"/>
+          <w:sz w:val="28"/>
+          <w:szCs w:val="28"/>
+        </w:rPr>
+      </w:pPr>
     </w:p>
     <w:p>
       <w:pPr>

</xml_diff>